<commit_message>
Polish operating system study experience
Clarify the Gabriela Mistral recorrido, neutralize the shared study guide, correct the multitasking explanation, fix text spacing regressions, reduce DOCX prominence, and preserve print behavior across the operating system materials.
</commit_message>
<xml_diff>
--- a/public/materiales/sistema-operativo/el-sistema-operativo-ficha.docx
+++ b/public/materiales/sistema-operativo/el-sistema-operativo-ficha.docx
@@ -659,7 +659,7 @@
               <w:t>proceso</w:t>
             </w:r>
             <w:r>
-              <w:t xml:space="preserve"> es un programa en ejecución; el mismo programa abierto dos veces son dos procesos distintos. La CPU ejecuta una instrucción por vez, así que no puede atender dos procesos en el mismo instante. El sistema operativo decide a quién le toca y por cuánto tiempo, según la prioridad de cada proceso: eso es la </w:t>
+              <w:t xml:space="preserve"> es un programa en ejecución; el mismo programa abierto dos veces son dos procesos distintos. Una computadora puede tener varios núcleos, capaces de ejecutar procesos al mismo tiempo. El sistema operativo distribuye los procesos entre los núcleos y organiza cuánto tiempo de CPU recibe cada uno: eso es la </w:t>
             </w:r>
             <w:r>
               <w:rPr>
@@ -668,7 +668,7 @@
               <w:t>planificación</w:t>
             </w:r>
             <w:r>
-              <w:t>. Va cambiando de proceso miles de veces por segundo.</w:t>
+              <w:t>. Cuando corresponde, también alterna rápidamente entre procesos.</w:t>
             </w:r>
           </w:p>
         </w:tc>

</xml_diff>